<commit_message>
feat(spikes): Add version file, build report, and wallets compatibility documentation
This commit introduces a new `version` file specifying the application version and signatures. It also expands the `builds.md` documentation with a detailed build report for Linux, Windows, and macOS, including an open question regarding Apple Store Connect credentials. Additionally, a comprehensive compatibility report for Ledger and Trezor wallets is added in `wallets.md`, outlining the CLI commands and hardware support for Bitcoin transactions.
</commit_message>
<xml_diff>
--- a/spikes/outputs/builds.docx
+++ b/spikes/outputs/builds.docx
@@ -2,14 +2,64 @@
 <file path=word/document.xml><?xml version="1.0" encoding="utf-8"?>
 <w:document xmlns:w="http://schemas.openxmlformats.org/wordprocessingml/2006/main" xmlns:m="http://schemas.openxmlformats.org/officeDocument/2006/math" xmlns:r="http://schemas.openxmlformats.org/officeDocument/2006/relationships" xmlns:o="urn:schemas-microsoft-com:office:office" xmlns:v="urn:schemas-microsoft-com:vml" xmlns:w10="urn:schemas-microsoft-com:office:word" xmlns:a="http://schemas.openxmlformats.org/drawingml/2006/main" xmlns:pic="http://schemas.openxmlformats.org/drawingml/2006/picture" xmlns:wp="http://schemas.openxmlformats.org/drawingml/2006/wordprocessingDrawing">
   <w:body>
+    <w:bookmarkStart w:id="20" w:name="build-report"/>
     <w:p>
       <w:pPr>
-        <w:pStyle w:val="FirstParagraph"/>
+        <w:pStyle w:val="Heading1"/>
       </w:pPr>
       <w:r>
-        <w:t xml:space="preserve">TODO: trigger builds</w:t>
+        <w:t xml:space="preserve">Build Report</w:t>
       </w:r>
     </w:p>
+    <w:p>
+      <w:pPr>
+        <w:pStyle w:val="FirstParagraph"/>
+      </w:pPr>
+      <w:r>
+        <w:t xml:space="preserve">We have successfully ran the CI pipeline to build packages for Linux and Windows platforms.</w:t>
+      </w:r>
+    </w:p>
+    <w:p>
+      <w:pPr>
+        <w:pStyle w:val="BodyText"/>
+      </w:pPr>
+      <w:r>
+        <w:t xml:space="preserve">For macOS, we are able to build the application successfully on local machines. However, building for macOS within the CI pipeline requires Apple Store Connect credentials for code signing.</w:t>
+      </w:r>
+    </w:p>
+    <w:p>
+      <w:pPr>
+        <w:pStyle w:val="BodyText"/>
+      </w:pPr>
+    </w:p>
+    <w:p>
+      <w:pPr>
+        <w:pStyle w:val="BodyText"/>
+      </w:pPr>
+    </w:p>
+    <w:bookmarkStart w:id="19" w:name="open-question"/>
+    <w:p>
+      <w:pPr>
+        <w:pStyle w:val="Heading2"/>
+      </w:pPr>
+      <w:r>
+        <w:t xml:space="preserve">Open Question</w:t>
+      </w:r>
+    </w:p>
+    <w:p>
+      <w:pPr>
+        <w:pStyle w:val="Compact"/>
+        <w:numPr>
+          <w:ilvl w:val="0"/>
+          <w:numId w:val="1001"/>
+        </w:numPr>
+      </w:pPr>
+      <w:r>
+        <w:t xml:space="preserve">Can Alpen provide Apple Store Connect credentials for macOS CI builds during development for testing porpoises?</w:t>
+      </w:r>
+    </w:p>
+    <w:bookmarkEnd w:id="19"/>
+    <w:bookmarkEnd w:id="20"/>
     <w:sectPr>
       <w:headerReference r:id="rId9" w:type="default"/>
       <w:footerReference r:id="rId10" w:type="default"/>
@@ -643,6 +693,109 @@
       </w:pPr>
     </w:lvl>
   </w:abstractNum>
+  <w:abstractNum w:abstractNumId="991">
+    <w:nsid w:val="0000A991"/>
+    <w:multiLevelType w:val="multilevel"/>
+    <w:lvl w:ilvl="0">
+      <w:numFmt w:val="bullet"/>
+      <w:lvlText w:val=""/>
+      <w:lvlJc w:val="left"/>
+      <w:pPr>
+        <w:ind w:left="720" w:hanging="360"/>
+      </w:pPr>
+      <w:rPr>
+        <w:rFonts w:ascii="Symbol" w:hAnsi="Symbol" w:cs="Symbol" w:hint="default"/>
+      </w:rPr>
+    </w:lvl>
+    <w:lvl w:ilvl="1">
+      <w:numFmt w:val="bullet"/>
+      <w:lvlText w:val="o"/>
+      <w:lvlJc w:val="left"/>
+      <w:pPr>
+        <w:ind w:left="1440" w:hanging="360"/>
+      </w:pPr>
+      <w:rPr>
+        <w:rFonts w:ascii="Courier New" w:hAnsi="Courier New" w:cs="Courier New" w:hint="default"/>
+      </w:rPr>
+    </w:lvl>
+    <w:lvl w:ilvl="2">
+      <w:numFmt w:val="bullet"/>
+      <w:lvlText w:val=""/>
+      <w:lvlJc w:val="left"/>
+      <w:pPr>
+        <w:ind w:left="2160" w:hanging="360"/>
+      </w:pPr>
+      <w:rPr>
+        <w:rFonts w:ascii="Wingdings" w:hAnsi="Wingdings" w:cs="Wingdings" w:hint="default"/>
+      </w:rPr>
+    </w:lvl>
+    <w:lvl w:ilvl="3">
+      <w:numFmt w:val="bullet"/>
+      <w:lvlText w:val=""/>
+      <w:lvlJc w:val="left"/>
+      <w:pPr>
+        <w:ind w:left="2880" w:hanging="360"/>
+      </w:pPr>
+      <w:rPr>
+        <w:rFonts w:ascii="Symbol" w:hAnsi="Symbol" w:cs="Symbol" w:hint="default"/>
+      </w:rPr>
+    </w:lvl>
+    <w:lvl w:ilvl="4">
+      <w:numFmt w:val="bullet"/>
+      <w:lvlText w:val="o"/>
+      <w:lvlJc w:val="left"/>
+      <w:pPr>
+        <w:ind w:left="3600" w:hanging="360"/>
+      </w:pPr>
+      <w:rPr>
+        <w:rFonts w:ascii="Courier New" w:hAnsi="Courier New" w:cs="Courier New" w:hint="default"/>
+      </w:rPr>
+    </w:lvl>
+    <w:lvl w:ilvl="5">
+      <w:numFmt w:val="bullet"/>
+      <w:lvlText w:val=""/>
+      <w:lvlJc w:val="left"/>
+      <w:pPr>
+        <w:ind w:left="4320" w:hanging="360"/>
+      </w:pPr>
+      <w:rPr>
+        <w:rFonts w:ascii="Wingdings" w:hAnsi="Wingdings" w:cs="Wingdings" w:hint="default"/>
+      </w:rPr>
+    </w:lvl>
+    <w:lvl w:ilvl="6">
+      <w:numFmt w:val="bullet"/>
+      <w:lvlText w:val=""/>
+      <w:lvlJc w:val="left"/>
+      <w:pPr>
+        <w:ind w:left="5040" w:hanging="360"/>
+      </w:pPr>
+      <w:rPr>
+        <w:rFonts w:ascii="Symbol" w:hAnsi="Symbol" w:cs="Symbol" w:hint="default"/>
+      </w:rPr>
+    </w:lvl>
+    <w:lvl w:ilvl="7">
+      <w:numFmt w:val="bullet"/>
+      <w:lvlText w:val="o"/>
+      <w:lvlJc w:val="left"/>
+      <w:pPr>
+        <w:ind w:left="5760" w:hanging="360"/>
+      </w:pPr>
+      <w:rPr>
+        <w:rFonts w:ascii="Courier New" w:hAnsi="Courier New" w:cs="Courier New" w:hint="default"/>
+      </w:rPr>
+    </w:lvl>
+    <w:lvl w:ilvl="8">
+      <w:numFmt w:val="bullet"/>
+      <w:lvlText w:val=""/>
+      <w:lvlJc w:val="left"/>
+      <w:pPr>
+        <w:ind w:left="6480" w:hanging="360"/>
+      </w:pPr>
+      <w:rPr>
+        <w:rFonts w:ascii="Wingdings" w:hAnsi="Wingdings" w:cs="Wingdings" w:hint="default"/>
+      </w:rPr>
+    </w:lvl>
+  </w:abstractNum>
   <w:num w:numId="1">
     <w:abstractNumId w:val="1"/>
   </w:num>
@@ -657,6 +810,9 @@
   </w:num>
   <w:num w:numId="1000">
     <w:abstractNumId w:val="990"/>
+  </w:num>
+  <w:num w:numId="1001">
+    <w:abstractNumId w:val="991"/>
   </w:num>
 </w:numbering>
 </file>

</xml_diff>